<commit_message>
Remove profile photo and reorder resume projects
</commit_message>
<xml_diff>
--- a/Rahul_Erukulla_Resume.docx
+++ b/Rahul_Erukulla_Resume.docx
@@ -606,7 +606,7 @@
           <w:sz w:val="20"/>
           <w:szCs w:val="20"/>
         </w:rPr>
-        <w:t>Blockchain Identity Management Application in Vehicular Ad Hoc Networks</w:t>
+        <w:t>AI Wedding Planning Application</w:t>
       </w:r>
     </w:p>
     <w:p>
@@ -631,11 +631,66 @@
       </w:pPr>
       <w:r>
         <w:rPr>
-          <w:color w:val="000000"/>
-          <w:sz w:val="20"/>
-          <w:szCs w:val="20"/>
-        </w:rPr>
-        <w:t>Developed a vehicular ad hoc network for encrypted communication between autonomous vehicles and infrastructure nodes.</w:t>
+          <w:sz w:val="20"/>
+          <w:szCs w:val="20"/>
+        </w:rPr>
+        <w:t>Developed an iOS-first AI wedding planning app with Expo React Native, Next.js, tRPC, Clerk, and Neon/Postgres to capture couple logistics and vision preferences.</w:t>
+      </w:r>
+    </w:p>
+    <w:p>
+      <w:pPr>
+        <w:numPr>
+          <w:ilvl w:val="0"/>
+          <w:numId w:val="1"/>
+        </w:numPr>
+        <w:spacing w:after="0" w:line="240" w:lineRule="auto"/>
+      </w:pPr>
+      <w:r>
+        <w:rPr>
+          <w:sz w:val="20"/>
+          <w:szCs w:val="20"/>
+        </w:rPr>
+        <w:t>Built a vision-aware vendor matching pipeline using deterministic filters plus Gemini ranking to score vendors by location, budget, style, capacity, and dealbreakers.</w:t>
+      </w:r>
+    </w:p>
+    <w:p>
+      <w:pPr>
+        <w:numPr>
+          <w:ilvl w:val="0"/>
+          <w:numId w:val="1"/>
+        </w:numPr>
+        <w:spacing w:after="0" w:line="240" w:lineRule="auto"/>
+      </w:pPr>
+      <w:r>
+        <w:rPr>
+          <w:sz w:val="20"/>
+          <w:szCs w:val="20"/>
+        </w:rPr>
+        <w:t>Implemented AI email drafting and vendor status workflows with Resend, Drizzle, Zod schemas, and React Query, supporting save/contact/book progression.</w:t>
+      </w:r>
+    </w:p>
+    <w:p>
+      <w:pPr>
+        <w:tabs>
+          <w:tab w:val="left" w:pos="180"/>
+          <w:tab w:val="right" w:pos="10080"/>
+        </w:tabs>
+        <w:spacing w:before="120" w:after="0" w:line="240" w:lineRule="auto"/>
+        <w:rPr>
+          <w:b/>
+          <w:bCs/>
+          <w:sz w:val="20"/>
+          <w:szCs w:val="20"/>
+        </w:rPr>
+      </w:pPr>
+      <w:r>
+        <w:rPr>
+          <w:b/>
+          <w:bCs/>
+          <w:sz w:val="20"/>
+          <w:szCs w:val="20"/>
+        </w:rPr>
+        <w:t>Blockchain Identity Management Application in Vehicular Ad Hoc Networks</w:t>
       </w:r>
     </w:p>
     <w:p>
@@ -664,31 +719,7 @@
           <w:sz w:val="20"/>
           <w:szCs w:val="20"/>
         </w:rPr>
-        <w:t>Designed the blockchain network using Hyperledger Fabric, allowing for nodes in the network to verify and manage vehicles and road-side units via smart contracts.</w:t>
-      </w:r>
-    </w:p>
-    <w:p>
-      <w:pPr>
-        <w:tabs>
-          <w:tab w:val="left" w:pos="180"/>
-          <w:tab w:val="right" w:pos="10080"/>
-        </w:tabs>
-        <w:spacing w:before="120" w:after="0" w:line="240" w:lineRule="auto"/>
-        <w:rPr>
-          <w:b/>
-          <w:bCs/>
-          <w:sz w:val="20"/>
-          <w:szCs w:val="20"/>
-        </w:rPr>
-      </w:pPr>
-      <w:r>
-        <w:rPr>
-          <w:b/>
-          <w:bCs/>
-          <w:sz w:val="20"/>
-          <w:szCs w:val="20"/>
-        </w:rPr>
-        <w:t xml:space="preserve">Agentic AI Assistant for Boutique </w:t>
+        <w:t>Developed a vehicular ad hoc network for encrypted communication between autonomous vehicles and infrastructure nodes.</w:t>
       </w:r>
     </w:p>
     <w:p>
@@ -717,7 +748,31 @@
           <w:sz w:val="20"/>
           <w:szCs w:val="20"/>
         </w:rPr>
-        <w:t>Architected a multi-agent AI assistant using CrewAI that autonomously handles inbound calls, books appointments, and resolves customer inquiries with natural language understanding — replacing manual receptionist workflows.</w:t>
+        <w:t>Designed the blockchain network using Hyperledger Fabric, allowing for nodes in the network to verify and manage vehicles and road-side units via smart contracts.</w:t>
+      </w:r>
+    </w:p>
+    <w:p>
+      <w:pPr>
+        <w:tabs>
+          <w:tab w:val="left" w:pos="180"/>
+          <w:tab w:val="right" w:pos="10080"/>
+        </w:tabs>
+        <w:spacing w:before="120" w:after="0" w:line="240" w:lineRule="auto"/>
+        <w:rPr>
+          <w:b/>
+          <w:bCs/>
+          <w:sz w:val="20"/>
+          <w:szCs w:val="20"/>
+        </w:rPr>
+      </w:pPr>
+      <w:r>
+        <w:rPr>
+          <w:b/>
+          <w:bCs/>
+          <w:sz w:val="20"/>
+          <w:szCs w:val="20"/>
+        </w:rPr>
+        <w:t xml:space="preserve">Agentic AI Assistant for Boutique </w:t>
       </w:r>
     </w:p>
     <w:p>
@@ -746,6 +801,35 @@
           <w:sz w:val="20"/>
           <w:szCs w:val="20"/>
         </w:rPr>
+        <w:t>Architected a multi-agent AI assistant using CrewAI that autonomously handles inbound calls, books appointments, and resolves customer inquiries with natural language understanding — replacing manual receptionist workflows.</w:t>
+      </w:r>
+    </w:p>
+    <w:p>
+      <w:pPr>
+        <w:numPr>
+          <w:ilvl w:val="0"/>
+          <w:numId w:val="1"/>
+        </w:numPr>
+        <w:pBdr>
+          <w:top w:val="nil"/>
+          <w:left w:val="nil"/>
+          <w:bottom w:val="nil"/>
+          <w:right w:val="nil"/>
+          <w:between w:val="nil"/>
+        </w:pBdr>
+        <w:spacing w:after="0" w:line="240" w:lineRule="auto"/>
+        <w:rPr>
+          <w:color w:val="000000"/>
+          <w:sz w:val="20"/>
+          <w:szCs w:val="20"/>
+        </w:rPr>
+      </w:pPr>
+      <w:r>
+        <w:rPr>
+          <w:color w:val="000000"/>
+          <w:sz w:val="20"/>
+          <w:szCs w:val="20"/>
+        </w:rPr>
         <w:t>Implemented conversational memory and context management to maintain multi-turn dialogue state across phone calls, achieving accurate intent resolution without human handoff.</w:t>
       </w:r>
     </w:p>
@@ -794,90 +878,6 @@
           <w:szCs w:val="20"/>
         </w:rPr>
         <w:t xml:space="preserve"> for high availability.</w:t>
-      </w:r>
-    </w:p>
-    <w:p>
-      <w:pPr>
-        <w:tabs>
-          <w:tab w:val="left" w:pos="180"/>
-          <w:tab w:val="right" w:pos="10080"/>
-        </w:tabs>
-        <w:spacing w:before="120" w:after="0" w:line="240" w:lineRule="auto"/>
-        <w:rPr>
-          <w:b/>
-          <w:bCs/>
-          <w:sz w:val="20"/>
-          <w:szCs w:val="20"/>
-        </w:rPr>
-      </w:pPr>
-      <w:r>
-        <w:rPr>
-          <w:b/>
-          <w:bCs/>
-          <w:sz w:val="20"/>
-          <w:szCs w:val="20"/>
-        </w:rPr>
-        <w:t>AI Wedding Planning Application</w:t>
-      </w:r>
-    </w:p>
-    <w:p>
-      <w:pPr>
-        <w:numPr>
-          <w:ilvl w:val="0"/>
-          <w:numId w:val="1"/>
-        </w:numPr>
-        <w:pBdr>
-          <w:top w:val="nil"/>
-          <w:left w:val="nil"/>
-          <w:bottom w:val="nil"/>
-          <w:right w:val="nil"/>
-          <w:between w:val="nil"/>
-        </w:pBdr>
-        <w:spacing w:after="0" w:line="240" w:lineRule="auto"/>
-        <w:rPr>
-          <w:color w:val="000000"/>
-          <w:sz w:val="20"/>
-          <w:szCs w:val="20"/>
-        </w:rPr>
-      </w:pPr>
-      <w:r>
-        <w:rPr>
-          <w:sz w:val="20"/>
-          <w:szCs w:val="20"/>
-        </w:rPr>
-        <w:t>Developed an iOS-first AI wedding planning app with Expo React Native, Next.js, tRPC, Clerk, and Neon/Postgres to capture couple logistics and vision preferences.</w:t>
-      </w:r>
-    </w:p>
-    <w:p>
-      <w:pPr>
-        <w:numPr>
-          <w:ilvl w:val="0"/>
-          <w:numId w:val="1"/>
-        </w:numPr>
-        <w:spacing w:after="0" w:line="240" w:lineRule="auto"/>
-      </w:pPr>
-      <w:r>
-        <w:rPr>
-          <w:sz w:val="20"/>
-          <w:szCs w:val="20"/>
-        </w:rPr>
-        <w:t>Built a vision-aware vendor matching pipeline using deterministic filters plus Gemini ranking to score vendors by location, budget, style, capacity, and dealbreakers.</w:t>
-      </w:r>
-    </w:p>
-    <w:p>
-      <w:pPr>
-        <w:numPr>
-          <w:ilvl w:val="0"/>
-          <w:numId w:val="1"/>
-        </w:numPr>
-        <w:spacing w:after="0" w:line="240" w:lineRule="auto"/>
-      </w:pPr>
-      <w:r>
-        <w:rPr>
-          <w:sz w:val="20"/>
-          <w:szCs w:val="20"/>
-        </w:rPr>
-        <w:t>Implemented AI email drafting and vendor status workflows with Resend, Drizzle, Zod schemas, and React Query, supporting save/contact/book progression.</w:t>
       </w:r>
     </w:p>
     <w:p>

</xml_diff>

<commit_message>
Update resume summary and leadership bullets
</commit_message>
<xml_diff>
--- a/Rahul_Erukulla_Resume.docx
+++ b/Rahul_Erukulla_Resume.docx
@@ -126,7 +126,7 @@
           <w:sz w:val="20"/>
           <w:szCs w:val="20"/>
         </w:rPr>
-        <w:t>AI-focused software engineer with 3+ years of experience building high-throughput payment APIs and AI-powered platforms in regulated environments. Skilled in designing multi-agent architectures, LLM-integrated tooling, and intelligent automation pipelines adopted across enterprise teams.</w:t>
+        <w:t>Senior Software Engineer with 3+ years of experience building high-throughput payment APIs, distributed backend systems, and AI-powered developer platforms in regulated environments. Skilled in Java/Spring Boot, production reliability, multi-agent AI systems, RAG, and CI/CD automation.</w:t>
       </w:r>
     </w:p>
     <w:p>
@@ -297,7 +297,7 @@
           <w:sz w:val="20"/>
           <w:szCs w:val="20"/>
         </w:rPr>
-        <w:t xml:space="preserve">Owned the </w:t>
+        <w:t>Owned the bulk requisition API end-to-end from design and architecture through development, client testing, release, and production support; supported millions of transactions with 99.999% availability, sub-second response times, and 500 TPS peak load.</w:t>
       </w:r>
       <w:r>
         <w:rPr>
@@ -305,7 +305,6 @@
           <w:sz w:val="20"/>
           <w:szCs w:val="20"/>
         </w:rPr>
-        <w:t xml:space="preserve">bulk requisition API </w:t>
       </w:r>
       <w:r>
         <w:rPr>
@@ -313,7 +312,6 @@
           <w:sz w:val="20"/>
           <w:szCs w:val="20"/>
         </w:rPr>
-        <w:t>end-to-end (design, architecture, development, deployment), supporting millions of transactions with 99.999% availability, sub-second response times, and scaling throughput to 500 TPS under peak load.</w:t>
       </w:r>
     </w:p>
     <w:p>
@@ -342,7 +340,7 @@
           <w:sz w:val="20"/>
           <w:szCs w:val="20"/>
         </w:rPr>
-        <w:t>Built an AI-driven chaos engineering platform using LangGraph and Claude that autonomously generates failure scenarios, injects faults, and analyzes system behavior; adopted across multiple teams to validate resilience at scale.</w:t>
+        <w:t>Led cross-team rollout of an AI-driven chaos engineering platform using LangGraph and Claude to generate failure scenarios, inject faults, and analyze system behavior, helping teams validate resilience at scale.</w:t>
       </w:r>
     </w:p>
     <w:p>
@@ -401,7 +399,7 @@
           <w:sz w:val="20"/>
           <w:szCs w:val="20"/>
         </w:rPr>
-        <w:t>Developed Java-based Spring APIs powering client interactions with virtual accounts, serving high-volume payment workflows across multiple product lines.</w:t>
+        <w:t>Mentored an apprentice engineer for 1+ year through design reviews, code reviews, and production delivery while building Java/Spring APIs for high-volume virtual account workflows across product lines.</w:t>
       </w:r>
     </w:p>
     <w:p>

</xml_diff>